<commit_message>
Point people to heilsugæslan, not Heilsuvera
Triage results (follow-up, heilsugæsla, child, other adult, non-renewable meds) now say to contact the health centre and book; the 'Opna Heilsuveru' button is gone. r-heilsuvera keeps its id for the CMS keys but is now 'Heilsugæslan þín'. Medalia screening (children) and the long questionnaire's 1700 line no longer mention Heilsuvera; JSON, setup sheets and .docx regenerated.

Co-Authored-By: Claude Opus 5.5 <noreply@anthropic.com>
</commit_message>
<xml_diff>
--- a/docs/medalia/opin-beidni-medalia.docx
+++ b/docs/medalia/opin-beidni-medalia.docx
@@ -1478,7 +1478,7 @@
         <w:spacing w:after="80"/>
       </w:pPr>
       <w:r>
-        <w:t xml:space="preserve">Hringdu í 1700 (Læknavaktin / Heilsuvera) ef þú þarft ráðgjöf strax.</w:t>
+        <w:t xml:space="preserve">Hringdu í 1700 (Læknavaktin) ef þú þarft ráðgjöf strax.</w:t>
       </w:r>
     </w:p>
     <w:p>
@@ -4393,7 +4393,7 @@
         <w:shd w:fill="F2F2F2" w:val="clear"/>
       </w:pPr>
       <w:r>
-        <w:t xml:space="preserve">Vegna barna: hafðu samband við heilsugæslu barnsins, til dæmis í gegnum Heilsuveru, eða hringdu í 1700 til að fá ráðgjöf.</w:t>
+        <w:t xml:space="preserve">Vegna barna: hafðu samband við heilsugæslu barnsins, eða hringdu í 1700 til að fá ráðgjöf.</w:t>
       </w:r>
     </w:p>
     <w:p>

</xml_diff>

<commit_message>
Screen for registration at an open heilsugæsla
The service is only for people registered at a heilsugæsla where it is open (now: Vestmannaeyjar).
- Triage: 'Fyrir mig' and 'annar fullorðinn → getur sent sjálfur' now ask whether the person is registered at an open heilsugæsla, listing them from the '+' lines of 'Virk þjónusta' on /thjonusta (activeClinics) — the same source as the map, so opening Selfoss there opens it here. 'Nei' → 'Þjónustan er ekki enn opin á þinni heilsugæslu' with the list, local advice and 1700.
- Medalia: reg-gate first on p-hentar; 'Nei' shows a stop message and hides scope-gate, and with it every later page (single-condition chain). ACTIVE_CLINICS in medalia_common.py. JSON, setup sheets, .docx regenerated.

Co-Authored-By: Claude Opus 5.5 <noreply@anthropic.com>
</commit_message>
<xml_diff>
--- a/docs/medalia/opin-beidni-medalia.docx
+++ b/docs/medalia/opin-beidni-medalia.docx
@@ -3330,7 +3330,7 @@
         <w:rPr>
           <w:rFonts w:ascii="Consolas" w:cs="Consolas" w:eastAsia="Consolas" w:hAnsi="Consolas"/>
         </w:rPr>
-        <w:t xml:space="preserve">scope-intro</w:t>
+        <w:t xml:space="preserve">reg-gate</w:t>
       </w:r>
     </w:p>
     <w:p>
@@ -3342,7 +3342,27 @@
           <w:i/>
           <w:iCs/>
         </w:rPr>
-        <w:t xml:space="preserve">Skýringartexti (display)</w:t>
+        <w:t xml:space="preserve">Einn valkostur — radio (choice)</w:t>
+      </w:r>
+      <w:r>
+        <w:rPr>
+          <w:b/>
+          <w:bCs/>
+          <w:color w:val="C00000"/>
+        </w:rPr>
+        <w:t xml:space="preserve">  ·  SKYLDA</w:t>
+      </w:r>
+    </w:p>
+    <w:p>
+      <w:pPr>
+        <w:keepNext/>
+      </w:pPr>
+      <w:r>
+        <w:rPr>
+          <w:b/>
+          <w:bCs/>
+        </w:rPr>
+        <w:t xml:space="preserve">Spurning:</w:t>
       </w:r>
     </w:p>
     <w:p>
@@ -3351,149 +3371,7 @@
         <w:spacing w:after="80"/>
       </w:pPr>
       <w:r>
-        <w:t xml:space="preserve">Sumt er ekki hægt að leysa í skriflegri fjarþjónustu, sama hversu vel því er lýst. Lestu listann og svaraðu svo spurningunni fyrir neðan. Þannig sparar þú þér bið eftir svari sem getur ekki hjálpað þér.</w:t>
-      </w:r>
-    </w:p>
-    <w:p>
-      <w:pPr>
-        <w:pStyle w:val="ListParagraph"/>
-        <w:numPr>
-          <w:ilvl w:val="0"/>
-          <w:numId w:val="2"/>
-        </w:numPr>
-        <w:shd w:fill="F2F2F2" w:val="clear"/>
-      </w:pPr>
-      <w:r>
-        <w:t xml:space="preserve">Erindið snýst um einhvern annan en þig, til dæmis barnið þitt, maka eða foreldri.</w:t>
-      </w:r>
-    </w:p>
-    <w:p>
-      <w:pPr>
-        <w:pStyle w:val="ListParagraph"/>
-        <w:numPr>
-          <w:ilvl w:val="0"/>
-          <w:numId w:val="2"/>
-        </w:numPr>
-        <w:shd w:fill="F2F2F2" w:val="clear"/>
-      </w:pPr>
-      <w:r>
-        <w:t xml:space="preserve">Þú vilt fá beiðni um blóðprufu eða aðra rannsókn, til dæmis þvag- eða hormónamælingu.</w:t>
-      </w:r>
-    </w:p>
-    <w:p>
-      <w:pPr>
-        <w:pStyle w:val="ListParagraph"/>
-        <w:numPr>
-          <w:ilvl w:val="0"/>
-          <w:numId w:val="2"/>
-        </w:numPr>
-        <w:shd w:fill="F2F2F2" w:val="clear"/>
-      </w:pPr>
-      <w:r>
-        <w:t xml:space="preserve">Þú vilt fá beiðni um myndgreiningu (röntgen, tölvusneiðmynd, segulómun eða ómun) eða speglun (til dæmis maga- eða ristilspeglun).</w:t>
-      </w:r>
-    </w:p>
-    <w:p>
-      <w:pPr>
-        <w:pStyle w:val="ListParagraph"/>
-        <w:numPr>
-          <w:ilvl w:val="0"/>
-          <w:numId w:val="2"/>
-        </w:numPr>
-        <w:shd w:fill="F2F2F2" w:val="clear"/>
-      </w:pPr>
-      <w:r>
-        <w:t xml:space="preserve">Þú vilt fá tilvísun til sérfræðings vegna vandamáls sem þarf nánari sögu og skoðun.</w:t>
-      </w:r>
-    </w:p>
-    <w:p>
-      <w:pPr>
-        <w:pStyle w:val="ListParagraph"/>
-        <w:numPr>
-          <w:ilvl w:val="0"/>
-          <w:numId w:val="2"/>
-        </w:numPr>
-        <w:shd w:fill="F2F2F2" w:val="clear"/>
-      </w:pPr>
-      <w:r>
-        <w:t xml:space="preserve">Vandamálið þarf skoðun, til dæmis að hlusta á hjarta eða lungu, skoða eyru eða háls, þreifa á kvið eða meta áverka, hnút eða fyrirferð.</w:t>
-      </w:r>
-    </w:p>
-    <w:p>
-      <w:pPr>
-        <w:pStyle w:val="ListParagraph"/>
-        <w:numPr>
-          <w:ilvl w:val="0"/>
-          <w:numId w:val="2"/>
-        </w:numPr>
-        <w:shd w:fill="F2F2F2" w:val="clear"/>
-      </w:pPr>
-      <w:r>
-        <w:t xml:space="preserve">Þú vilt fá lyfseðil fyrir lyf sem þú færð skömmtuð í lyfjarúllu frá apóteki, eða breytingu á skömmtuninni.</w:t>
-      </w:r>
-    </w:p>
-    <w:p>
-      <w:pPr>
-        <w:spacing w:after="120"/>
-      </w:pPr>
-      <w:r>
-        <w:t xml:space="preserve"/>
-      </w:r>
-    </w:p>
-    <w:p>
-      <w:pPr>
-        <w:pStyle w:val="Heading3"/>
-        <w:keepNext/>
-      </w:pPr>
-      <w:r>
-        <w:t xml:space="preserve">3.2 · </w:t>
-      </w:r>
-      <w:r>
-        <w:rPr>
-          <w:rFonts w:ascii="Consolas" w:cs="Consolas" w:eastAsia="Consolas" w:hAnsi="Consolas"/>
-        </w:rPr>
-        <w:t xml:space="preserve">scope-gate</w:t>
-      </w:r>
-    </w:p>
-    <w:p>
-      <w:pPr>
-        <w:keepNext/>
-      </w:pPr>
-      <w:r>
-        <w:rPr>
-          <w:i/>
-          <w:iCs/>
-        </w:rPr>
-        <w:t xml:space="preserve">Einn valkostur — radio (choice)</w:t>
-      </w:r>
-      <w:r>
-        <w:rPr>
-          <w:b/>
-          <w:bCs/>
-          <w:color w:val="C00000"/>
-        </w:rPr>
-        <w:t xml:space="preserve">  ·  SKYLDA</w:t>
-      </w:r>
-    </w:p>
-    <w:p>
-      <w:pPr>
-        <w:keepNext/>
-      </w:pPr>
-      <w:r>
-        <w:rPr>
-          <w:b/>
-          <w:bCs/>
-        </w:rPr>
-        <w:t xml:space="preserve">Spurning:</w:t>
-      </w:r>
-    </w:p>
-    <w:p>
-      <w:pPr>
-        <w:shd w:fill="F2F2F2" w:val="clear"/>
-        <w:spacing w:after="80"/>
-      </w:pPr>
-      <w:r>
-        <w:t xml:space="preserve">Á eitthvað af ofangreindu við um erindið þitt?</w:t>
+        <w:t xml:space="preserve">Ertu skráð eða skráður á heilsugæslu þar sem þjónustan er í boði?</w:t>
       </w:r>
     </w:p>
     <w:p>
@@ -3705,7 +3583,7 @@
           <w:i/>
           <w:iCs/>
         </w:rPr>
-        <w:t xml:space="preserve">Viltu aðeins fá útskýringu á niðurstöðum sem þú hefur þegar fengið, eða endurnýjun á lyfi sem þú sækir sjálf eða sjálfur í apótek? Það getum við gert. Svaraðu þá „Nei“.</w:t>
+        <w:t xml:space="preserve">Þjónustan er enn sem komið er aðeins í boði fyrir fólk sem er skráð á: Heilsugæslan í Vestmannaeyjum. Ertu ekki viss? Þú sérð á hvaða heilsugæslu þú ert skráð eða skráður á Mínum síðum á island.is.</w:t>
       </w:r>
     </w:p>
     <w:p>
@@ -3722,13 +3600,13 @@
         <w:keepNext/>
       </w:pPr>
       <w:r>
-        <w:t xml:space="preserve">3.3 · </w:t>
+        <w:t xml:space="preserve">3.2 · </w:t>
       </w:r>
       <w:r>
         <w:rPr>
           <w:rFonts w:ascii="Consolas" w:cs="Consolas" w:eastAsia="Consolas" w:hAnsi="Consolas"/>
         </w:rPr>
-        <w:t xml:space="preserve">scope-stop</w:t>
+        <w:t xml:space="preserve">reg-stop</w:t>
       </w:r>
     </w:p>
     <w:p>
@@ -3749,7 +3627,7 @@
         <w:spacing w:after="80"/>
       </w:pPr>
       <w:r>
-        <w:t xml:space="preserve">⛔ Við getum ekki afgreitt þetta erindi í fjarþjónustu.</w:t>
+        <w:t xml:space="preserve">⛔ Þjónustan er ekki enn opin á þinni heilsugæslu.</w:t>
       </w:r>
     </w:p>
     <w:p>
@@ -3758,7 +3636,7 @@
         <w:spacing w:after="80"/>
       </w:pPr>
       <w:r>
-        <w:t xml:space="preserve">Það er ekki vegna þess að erindið skipti ekki máli, heldur vegna þess að það þarf þjónustu sem ekki er hægt að veita skriflega. Merktu við hvað á við og þá sérðu hvert þú getur leitað.</w:t>
+        <w:t xml:space="preserve">Fjarlækningar opna fyrir þjónustuna eina heilsugæslu í einu og fleiri heilsugæslur á Suðurlandi bætast við á næstunni. Þangað til skaltu hafa samband við heilsugæsluna þína, eða hringja í 1700 ef þú þarft ráð strax.</w:t>
       </w:r>
     </w:p>
     <w:p>
@@ -3767,7 +3645,7 @@
         <w:spacing w:after="80"/>
       </w:pPr>
       <w:r>
-        <w:t xml:space="preserve">Þú þarft ekki að senda erindið. Ef þú merktir við þetta fyrir mistök, breyttu svarinu í „Nei“ til að halda áfram.</w:t>
+        <w:t xml:space="preserve">Þú þarft ekki að senda erindið. Ef þú merktir við þetta fyrir mistök, breyttu svarinu í „Já“ til að halda áfram.</w:t>
       </w:r>
     </w:p>
     <w:p>
@@ -3786,7 +3664,7 @@
         <w:rPr>
           <w:rFonts w:ascii="Consolas" w:cs="Consolas" w:eastAsia="Consolas" w:hAnsi="Consolas"/>
         </w:rPr>
-        <w:t xml:space="preserve">scope-gate</w:t>
+        <w:t xml:space="preserve">reg-gate</w:t>
       </w:r>
       <w:r>
         <w:t xml:space="preserve"> = </w:t>
@@ -3796,14 +3674,14 @@
           <w:b/>
           <w:bCs/>
         </w:rPr>
-        <w:t xml:space="preserve">„Já“</w:t>
+        <w:t xml:space="preserve">„Nei“</w:t>
       </w:r>
       <w:r>
         <w:rPr>
           <w:rFonts w:ascii="Consolas" w:cs="Consolas" w:eastAsia="Consolas" w:hAnsi="Consolas"/>
           <w:color w:val="666666"/>
         </w:rPr>
-        <w:t xml:space="preserve"> (yes)</w:t>
+        <w:t xml:space="preserve"> (no)</w:t>
       </w:r>
     </w:p>
     <w:p>
@@ -3820,13 +3698,13 @@
         <w:keepNext/>
       </w:pPr>
       <w:r>
-        <w:t xml:space="preserve">3.4 · </w:t>
+        <w:t xml:space="preserve">3.3 · </w:t>
       </w:r>
       <w:r>
         <w:rPr>
           <w:rFonts w:ascii="Consolas" w:cs="Consolas" w:eastAsia="Consolas" w:hAnsi="Consolas"/>
         </w:rPr>
-        <w:t xml:space="preserve">scope-which</w:t>
+        <w:t xml:space="preserve">scope-intro</w:t>
       </w:r>
     </w:p>
     <w:p>
@@ -3838,27 +3716,7 @@
           <w:i/>
           <w:iCs/>
         </w:rPr>
-        <w:t xml:space="preserve">Fjölval — gátreitir (choice, repeats)</w:t>
-      </w:r>
-      <w:r>
-        <w:rPr>
-          <w:b/>
-          <w:bCs/>
-          <w:color w:val="C00000"/>
-        </w:rPr>
-        <w:t xml:space="preserve">  ·  SKYLDA</w:t>
-      </w:r>
-    </w:p>
-    <w:p>
-      <w:pPr>
-        <w:keepNext/>
-      </w:pPr>
-      <w:r>
-        <w:rPr>
-          <w:b/>
-          <w:bCs/>
-        </w:rPr>
-        <w:t xml:space="preserve">Spurning:</w:t>
+        <w:t xml:space="preserve">Skýringartexti (display)</w:t>
       </w:r>
     </w:p>
     <w:p>
@@ -3867,7 +3725,85 @@
         <w:spacing w:after="80"/>
       </w:pPr>
       <w:r>
-        <w:t xml:space="preserve">Hvað af þessu á við? Merktu við allt sem á við.</w:t>
+        <w:t xml:space="preserve">Sumt er ekki hægt að leysa í skriflegri fjarþjónustu, sama hversu vel því er lýst. Lestu listann og svaraðu svo spurningunni fyrir neðan. Þannig sparar þú þér bið eftir svari sem getur ekki hjálpað þér.</w:t>
+      </w:r>
+    </w:p>
+    <w:p>
+      <w:pPr>
+        <w:pStyle w:val="ListParagraph"/>
+        <w:numPr>
+          <w:ilvl w:val="0"/>
+          <w:numId w:val="2"/>
+        </w:numPr>
+        <w:shd w:fill="F2F2F2" w:val="clear"/>
+      </w:pPr>
+      <w:r>
+        <w:t xml:space="preserve">Erindið snýst um einhvern annan en þig, til dæmis barnið þitt, maka eða foreldri.</w:t>
+      </w:r>
+    </w:p>
+    <w:p>
+      <w:pPr>
+        <w:pStyle w:val="ListParagraph"/>
+        <w:numPr>
+          <w:ilvl w:val="0"/>
+          <w:numId w:val="2"/>
+        </w:numPr>
+        <w:shd w:fill="F2F2F2" w:val="clear"/>
+      </w:pPr>
+      <w:r>
+        <w:t xml:space="preserve">Þú vilt fá beiðni um blóðprufu eða aðra rannsókn, til dæmis þvag- eða hormónamælingu.</w:t>
+      </w:r>
+    </w:p>
+    <w:p>
+      <w:pPr>
+        <w:pStyle w:val="ListParagraph"/>
+        <w:numPr>
+          <w:ilvl w:val="0"/>
+          <w:numId w:val="2"/>
+        </w:numPr>
+        <w:shd w:fill="F2F2F2" w:val="clear"/>
+      </w:pPr>
+      <w:r>
+        <w:t xml:space="preserve">Þú vilt fá beiðni um myndgreiningu (röntgen, tölvusneiðmynd, segulómun eða ómun) eða speglun (til dæmis maga- eða ristilspeglun).</w:t>
+      </w:r>
+    </w:p>
+    <w:p>
+      <w:pPr>
+        <w:pStyle w:val="ListParagraph"/>
+        <w:numPr>
+          <w:ilvl w:val="0"/>
+          <w:numId w:val="2"/>
+        </w:numPr>
+        <w:shd w:fill="F2F2F2" w:val="clear"/>
+      </w:pPr>
+      <w:r>
+        <w:t xml:space="preserve">Þú vilt fá tilvísun til sérfræðings vegna vandamáls sem þarf nánari sögu og skoðun.</w:t>
+      </w:r>
+    </w:p>
+    <w:p>
+      <w:pPr>
+        <w:pStyle w:val="ListParagraph"/>
+        <w:numPr>
+          <w:ilvl w:val="0"/>
+          <w:numId w:val="2"/>
+        </w:numPr>
+        <w:shd w:fill="F2F2F2" w:val="clear"/>
+      </w:pPr>
+      <w:r>
+        <w:t xml:space="preserve">Vandamálið þarf skoðun, til dæmis að hlusta á hjarta eða lungu, skoða eyru eða háls, þreifa á kvið eða meta áverka, hnút eða fyrirferð.</w:t>
+      </w:r>
+    </w:p>
+    <w:p>
+      <w:pPr>
+        <w:pStyle w:val="ListParagraph"/>
+        <w:numPr>
+          <w:ilvl w:val="0"/>
+          <w:numId w:val="2"/>
+        </w:numPr>
+        <w:shd w:fill="F2F2F2" w:val="clear"/>
+      </w:pPr>
+      <w:r>
+        <w:t xml:space="preserve">Þú vilt fá lyfseðil fyrir lyf sem þú færð skömmtuð í lyfjarúllu frá apóteki, eða breytingu á skömmtuninni.</w:t>
       </w:r>
     </w:p>
     <w:p>
@@ -3886,7 +3822,107 @@
         <w:rPr>
           <w:rFonts w:ascii="Consolas" w:cs="Consolas" w:eastAsia="Consolas" w:hAnsi="Consolas"/>
         </w:rPr>
+        <w:t xml:space="preserve">reg-gate</w:t>
+      </w:r>
+      <w:r>
+        <w:t xml:space="preserve"> = </w:t>
+      </w:r>
+      <w:r>
+        <w:rPr>
+          <w:b/>
+          <w:bCs/>
+        </w:rPr>
+        <w:t xml:space="preserve">„Já“</w:t>
+      </w:r>
+      <w:r>
+        <w:rPr>
+          <w:rFonts w:ascii="Consolas" w:cs="Consolas" w:eastAsia="Consolas" w:hAnsi="Consolas"/>
+          <w:color w:val="666666"/>
+        </w:rPr>
+        <w:t xml:space="preserve"> (yes)</w:t>
+      </w:r>
+    </w:p>
+    <w:p>
+      <w:pPr>
+        <w:spacing w:after="120"/>
+      </w:pPr>
+      <w:r>
+        <w:t xml:space="preserve"/>
+      </w:r>
+    </w:p>
+    <w:p>
+      <w:pPr>
+        <w:pStyle w:val="Heading3"/>
+        <w:keepNext/>
+      </w:pPr>
+      <w:r>
+        <w:t xml:space="preserve">3.4 · </w:t>
+      </w:r>
+      <w:r>
+        <w:rPr>
+          <w:rFonts w:ascii="Consolas" w:cs="Consolas" w:eastAsia="Consolas" w:hAnsi="Consolas"/>
+        </w:rPr>
         <w:t xml:space="preserve">scope-gate</w:t>
+      </w:r>
+    </w:p>
+    <w:p>
+      <w:pPr>
+        <w:keepNext/>
+      </w:pPr>
+      <w:r>
+        <w:rPr>
+          <w:i/>
+          <w:iCs/>
+        </w:rPr>
+        <w:t xml:space="preserve">Einn valkostur — radio (choice)</w:t>
+      </w:r>
+      <w:r>
+        <w:rPr>
+          <w:b/>
+          <w:bCs/>
+          <w:color w:val="C00000"/>
+        </w:rPr>
+        <w:t xml:space="preserve">  ·  SKYLDA</w:t>
+      </w:r>
+    </w:p>
+    <w:p>
+      <w:pPr>
+        <w:keepNext/>
+      </w:pPr>
+      <w:r>
+        <w:rPr>
+          <w:b/>
+          <w:bCs/>
+        </w:rPr>
+        <w:t xml:space="preserve">Spurning:</w:t>
+      </w:r>
+    </w:p>
+    <w:p>
+      <w:pPr>
+        <w:shd w:fill="F2F2F2" w:val="clear"/>
+        <w:spacing w:after="80"/>
+      </w:pPr>
+      <w:r>
+        <w:t xml:space="preserve">Á eitthvað af ofangreindu við um erindið þitt?</w:t>
+      </w:r>
+    </w:p>
+    <w:p>
+      <w:pPr>
+        <w:shd w:fill="FFF2CC" w:val="clear"/>
+        <w:spacing w:before="80"/>
+      </w:pPr>
+      <w:r>
+        <w:rPr>
+          <w:b/>
+          <w:bCs/>
+        </w:rPr>
+        <w:t xml:space="preserve">Birtist ef: </w:t>
+      </w:r>
+      <w:r>
+        <w:rPr>
+          <w:rFonts w:ascii="Consolas" w:cs="Consolas" w:eastAsia="Consolas" w:hAnsi="Consolas"/>
+        </w:rPr>
+        <w:t xml:space="preserve">reg-gate</w:t>
       </w:r>
       <w:r>
         <w:t xml:space="preserve"> = </w:t>
@@ -4010,7 +4046,7 @@
                 <w:b w:val="false"/>
                 <w:bCs w:val="false"/>
               </w:rPr>
-              <w:t xml:space="preserve">other-person</w:t>
+              <w:t xml:space="preserve">yes</w:t>
             </w:r>
           </w:p>
         </w:tc>
@@ -4036,7 +4072,7 @@
                 <w:b w:val="false"/>
                 <w:bCs w:val="false"/>
               </w:rPr>
-              <w:t xml:space="preserve">Erindið snýst um barn eða annan einstakling</w:t>
+              <w:t xml:space="preserve">Já</w:t>
             </w:r>
           </w:p>
         </w:tc>
@@ -4065,7 +4101,7 @@
                 <w:b w:val="false"/>
                 <w:bCs w:val="false"/>
               </w:rPr>
-              <w:t xml:space="preserve">lab-tests</w:t>
+              <w:t xml:space="preserve">no</w:t>
             </w:r>
           </w:p>
         </w:tc>
@@ -4091,7 +4127,307 @@
                 <w:b w:val="false"/>
                 <w:bCs w:val="false"/>
               </w:rPr>
-              <w:t xml:space="preserve">Beiðni um blóðprufu eða aðra rannsókn</w:t>
+              <w:t xml:space="preserve">Nei</w:t>
+            </w:r>
+          </w:p>
+        </w:tc>
+      </w:tr>
+    </w:tbl>
+    <w:p>
+      <w:pPr>
+        <w:spacing w:before="80"/>
+      </w:pPr>
+      <w:r>
+        <w:rPr>
+          <w:b/>
+          <w:bCs/>
+          <w:i/>
+          <w:iCs/>
+        </w:rPr>
+        <w:t xml:space="preserve">Hjálpartexti: </w:t>
+      </w:r>
+      <w:r>
+        <w:rPr>
+          <w:i/>
+          <w:iCs/>
+        </w:rPr>
+        <w:t xml:space="preserve">Viltu aðeins fá útskýringu á niðurstöðum sem þú hefur þegar fengið, eða endurnýjun á lyfi sem þú sækir sjálf eða sjálfur í apótek? Það getum við gert. Svaraðu þá „Nei“.</w:t>
+      </w:r>
+    </w:p>
+    <w:p>
+      <w:pPr>
+        <w:spacing w:after="120"/>
+      </w:pPr>
+      <w:r>
+        <w:t xml:space="preserve"/>
+      </w:r>
+    </w:p>
+    <w:p>
+      <w:pPr>
+        <w:pStyle w:val="Heading3"/>
+        <w:keepNext/>
+      </w:pPr>
+      <w:r>
+        <w:t xml:space="preserve">3.5 · </w:t>
+      </w:r>
+      <w:r>
+        <w:rPr>
+          <w:rFonts w:ascii="Consolas" w:cs="Consolas" w:eastAsia="Consolas" w:hAnsi="Consolas"/>
+        </w:rPr>
+        <w:t xml:space="preserve">scope-stop</w:t>
+      </w:r>
+    </w:p>
+    <w:p>
+      <w:pPr>
+        <w:keepNext/>
+      </w:pPr>
+      <w:r>
+        <w:rPr>
+          <w:i/>
+          <w:iCs/>
+        </w:rPr>
+        <w:t xml:space="preserve">Skýringartexti (display)</w:t>
+      </w:r>
+    </w:p>
+    <w:p>
+      <w:pPr>
+        <w:shd w:fill="F2F2F2" w:val="clear"/>
+        <w:spacing w:after="80"/>
+      </w:pPr>
+      <w:r>
+        <w:t xml:space="preserve">⛔ Við getum ekki afgreitt þetta erindi í fjarþjónustu.</w:t>
+      </w:r>
+    </w:p>
+    <w:p>
+      <w:pPr>
+        <w:shd w:fill="F2F2F2" w:val="clear"/>
+        <w:spacing w:after="80"/>
+      </w:pPr>
+      <w:r>
+        <w:t xml:space="preserve">Það er ekki vegna þess að erindið skipti ekki máli, heldur vegna þess að það þarf þjónustu sem ekki er hægt að veita skriflega. Merktu við hvað á við og þá sérðu hvert þú getur leitað.</w:t>
+      </w:r>
+    </w:p>
+    <w:p>
+      <w:pPr>
+        <w:shd w:fill="F2F2F2" w:val="clear"/>
+        <w:spacing w:after="80"/>
+      </w:pPr>
+      <w:r>
+        <w:t xml:space="preserve">Þú þarft ekki að senda erindið. Ef þú merktir við þetta fyrir mistök, breyttu svarinu í „Nei“ til að halda áfram.</w:t>
+      </w:r>
+    </w:p>
+    <w:p>
+      <w:pPr>
+        <w:shd w:fill="FFF2CC" w:val="clear"/>
+        <w:spacing w:before="80"/>
+      </w:pPr>
+      <w:r>
+        <w:rPr>
+          <w:b/>
+          <w:bCs/>
+        </w:rPr>
+        <w:t xml:space="preserve">Birtist ef: </w:t>
+      </w:r>
+      <w:r>
+        <w:rPr>
+          <w:rFonts w:ascii="Consolas" w:cs="Consolas" w:eastAsia="Consolas" w:hAnsi="Consolas"/>
+        </w:rPr>
+        <w:t xml:space="preserve">scope-gate</w:t>
+      </w:r>
+      <w:r>
+        <w:t xml:space="preserve"> = </w:t>
+      </w:r>
+      <w:r>
+        <w:rPr>
+          <w:b/>
+          <w:bCs/>
+        </w:rPr>
+        <w:t xml:space="preserve">„Já“</w:t>
+      </w:r>
+      <w:r>
+        <w:rPr>
+          <w:rFonts w:ascii="Consolas" w:cs="Consolas" w:eastAsia="Consolas" w:hAnsi="Consolas"/>
+          <w:color w:val="666666"/>
+        </w:rPr>
+        <w:t xml:space="preserve"> (yes)</w:t>
+      </w:r>
+    </w:p>
+    <w:p>
+      <w:pPr>
+        <w:spacing w:after="120"/>
+      </w:pPr>
+      <w:r>
+        <w:t xml:space="preserve"/>
+      </w:r>
+    </w:p>
+    <w:p>
+      <w:pPr>
+        <w:pStyle w:val="Heading3"/>
+        <w:keepNext/>
+      </w:pPr>
+      <w:r>
+        <w:t xml:space="preserve">3.6 · </w:t>
+      </w:r>
+      <w:r>
+        <w:rPr>
+          <w:rFonts w:ascii="Consolas" w:cs="Consolas" w:eastAsia="Consolas" w:hAnsi="Consolas"/>
+        </w:rPr>
+        <w:t xml:space="preserve">scope-which</w:t>
+      </w:r>
+    </w:p>
+    <w:p>
+      <w:pPr>
+        <w:keepNext/>
+      </w:pPr>
+      <w:r>
+        <w:rPr>
+          <w:i/>
+          <w:iCs/>
+        </w:rPr>
+        <w:t xml:space="preserve">Fjölval — gátreitir (choice, repeats)</w:t>
+      </w:r>
+      <w:r>
+        <w:rPr>
+          <w:b/>
+          <w:bCs/>
+          <w:color w:val="C00000"/>
+        </w:rPr>
+        <w:t xml:space="preserve">  ·  SKYLDA</w:t>
+      </w:r>
+    </w:p>
+    <w:p>
+      <w:pPr>
+        <w:keepNext/>
+      </w:pPr>
+      <w:r>
+        <w:rPr>
+          <w:b/>
+          <w:bCs/>
+        </w:rPr>
+        <w:t xml:space="preserve">Spurning:</w:t>
+      </w:r>
+    </w:p>
+    <w:p>
+      <w:pPr>
+        <w:shd w:fill="F2F2F2" w:val="clear"/>
+        <w:spacing w:after="80"/>
+      </w:pPr>
+      <w:r>
+        <w:t xml:space="preserve">Hvað af þessu á við? Merktu við allt sem á við.</w:t>
+      </w:r>
+    </w:p>
+    <w:p>
+      <w:pPr>
+        <w:shd w:fill="FFF2CC" w:val="clear"/>
+        <w:spacing w:before="80"/>
+      </w:pPr>
+      <w:r>
+        <w:rPr>
+          <w:b/>
+          <w:bCs/>
+        </w:rPr>
+        <w:t xml:space="preserve">Birtist ef: </w:t>
+      </w:r>
+      <w:r>
+        <w:rPr>
+          <w:rFonts w:ascii="Consolas" w:cs="Consolas" w:eastAsia="Consolas" w:hAnsi="Consolas"/>
+        </w:rPr>
+        <w:t xml:space="preserve">scope-gate</w:t>
+      </w:r>
+      <w:r>
+        <w:t xml:space="preserve"> = </w:t>
+      </w:r>
+      <w:r>
+        <w:rPr>
+          <w:b/>
+          <w:bCs/>
+        </w:rPr>
+        <w:t xml:space="preserve">„Já“</w:t>
+      </w:r>
+      <w:r>
+        <w:rPr>
+          <w:rFonts w:ascii="Consolas" w:cs="Consolas" w:eastAsia="Consolas" w:hAnsi="Consolas"/>
+          <w:color w:val="666666"/>
+        </w:rPr>
+        <w:t xml:space="preserve"> (yes)</w:t>
+      </w:r>
+    </w:p>
+    <w:p>
+      <w:r>
+        <w:t xml:space="preserve"/>
+      </w:r>
+    </w:p>
+    <w:tbl>
+      <w:tblPr>
+        <w:tblW w:type="dxa" w:w="9026"/>
+        <w:tblBorders>
+          <w:top w:val="single" w:color="auto" w:sz="4"/>
+          <w:left w:val="single" w:color="auto" w:sz="4"/>
+          <w:bottom w:val="single" w:color="auto" w:sz="4"/>
+          <w:right w:val="single" w:color="auto" w:sz="4"/>
+          <w:insideH w:val="single" w:color="auto" w:sz="4"/>
+          <w:insideV w:val="single" w:color="auto" w:sz="4"/>
+        </w:tblBorders>
+      </w:tblPr>
+      <w:tblGrid>
+        <w:gridCol w:w="2200"/>
+        <w:gridCol w:w="6826"/>
+      </w:tblGrid>
+      <w:tr>
+        <w:trPr>
+          <w:tblHeader/>
+        </w:trPr>
+        <w:tc>
+          <w:tcPr>
+            <w:tcW w:type="dxa" w:w="2200"/>
+            <w:tcBorders>
+              <w:top w:val="single" w:color="BFBFBF" w:sz="4"/>
+              <w:left w:val="single" w:color="BFBFBF" w:sz="4"/>
+              <w:bottom w:val="single" w:color="BFBFBF" w:sz="4"/>
+              <w:right w:val="single" w:color="BFBFBF" w:sz="4"/>
+            </w:tcBorders>
+            <w:shd w:fill="F2F2F2" w:val="clear"/>
+            <w:tcMar>
+              <w:top w:type="dxa" w:w="60"/>
+              <w:left w:type="dxa" w:w="120"/>
+              <w:bottom w:type="dxa" w:w="60"/>
+              <w:right w:type="dxa" w:w="120"/>
+            </w:tcMar>
+          </w:tcPr>
+          <w:p>
+            <w:r>
+              <w:rPr>
+                <w:b/>
+                <w:bCs/>
+              </w:rPr>
+              <w:t xml:space="preserve">Kóði</w:t>
+            </w:r>
+          </w:p>
+        </w:tc>
+        <w:tc>
+          <w:tcPr>
+            <w:tcW w:type="dxa" w:w="6826"/>
+            <w:tcBorders>
+              <w:top w:val="single" w:color="BFBFBF" w:sz="4"/>
+              <w:left w:val="single" w:color="BFBFBF" w:sz="4"/>
+              <w:bottom w:val="single" w:color="BFBFBF" w:sz="4"/>
+              <w:right w:val="single" w:color="BFBFBF" w:sz="4"/>
+            </w:tcBorders>
+            <w:shd w:fill="F2F2F2" w:val="clear"/>
+            <w:tcMar>
+              <w:top w:type="dxa" w:w="60"/>
+              <w:left w:type="dxa" w:w="120"/>
+              <w:bottom w:type="dxa" w:w="60"/>
+              <w:right w:type="dxa" w:w="120"/>
+            </w:tcMar>
+          </w:tcPr>
+          <w:p>
+            <w:r>
+              <w:rPr>
+                <w:b/>
+                <w:bCs/>
+              </w:rPr>
+              <w:t xml:space="preserve">Texti sem sjúklingur sér</w:t>
             </w:r>
           </w:p>
         </w:tc>
@@ -4120,7 +4456,7 @@
                 <w:b w:val="false"/>
                 <w:bCs w:val="false"/>
               </w:rPr>
-              <w:t xml:space="preserve">imaging</w:t>
+              <w:t xml:space="preserve">other-person</w:t>
             </w:r>
           </w:p>
         </w:tc>
@@ -4146,7 +4482,7 @@
                 <w:b w:val="false"/>
                 <w:bCs w:val="false"/>
               </w:rPr>
-              <w:t xml:space="preserve">Beiðni um myndgreiningu eða speglun</w:t>
+              <w:t xml:space="preserve">Erindið snýst um barn eða annan einstakling</w:t>
             </w:r>
           </w:p>
         </w:tc>
@@ -4175,7 +4511,7 @@
                 <w:b w:val="false"/>
                 <w:bCs w:val="false"/>
               </w:rPr>
-              <w:t xml:space="preserve">referral</w:t>
+              <w:t xml:space="preserve">lab-tests</w:t>
             </w:r>
           </w:p>
         </w:tc>
@@ -4201,7 +4537,7 @@
                 <w:b w:val="false"/>
                 <w:bCs w:val="false"/>
               </w:rPr>
-              <w:t xml:space="preserve">Tilvísun sem þarf nánari sögu og skoðun</w:t>
+              <w:t xml:space="preserve">Beiðni um blóðprufu eða aðra rannsókn</w:t>
             </w:r>
           </w:p>
         </w:tc>
@@ -4230,7 +4566,7 @@
                 <w:b w:val="false"/>
                 <w:bCs w:val="false"/>
               </w:rPr>
-              <w:t xml:space="preserve">exam</w:t>
+              <w:t xml:space="preserve">imaging</w:t>
             </w:r>
           </w:p>
         </w:tc>
@@ -4256,7 +4592,7 @@
                 <w:b w:val="false"/>
                 <w:bCs w:val="false"/>
               </w:rPr>
-              <w:t xml:space="preserve">Vandamál sem þarf að skoða</w:t>
+              <w:t xml:space="preserve">Beiðni um myndgreiningu eða speglun</w:t>
             </w:r>
           </w:p>
         </w:tc>
@@ -4285,6 +4621,116 @@
                 <w:b w:val="false"/>
                 <w:bCs w:val="false"/>
               </w:rPr>
+              <w:t xml:space="preserve">referral</w:t>
+            </w:r>
+          </w:p>
+        </w:tc>
+        <w:tc>
+          <w:tcPr>
+            <w:tcW w:type="dxa" w:w="6826"/>
+            <w:tcBorders>
+              <w:top w:val="single" w:color="BFBFBF" w:sz="4"/>
+              <w:left w:val="single" w:color="BFBFBF" w:sz="4"/>
+              <w:bottom w:val="single" w:color="BFBFBF" w:sz="4"/>
+              <w:right w:val="single" w:color="BFBFBF" w:sz="4"/>
+            </w:tcBorders>
+            <w:tcMar>
+              <w:top w:type="dxa" w:w="60"/>
+              <w:left w:type="dxa" w:w="120"/>
+              <w:bottom w:type="dxa" w:w="60"/>
+              <w:right w:type="dxa" w:w="120"/>
+            </w:tcMar>
+          </w:tcPr>
+          <w:p>
+            <w:r>
+              <w:rPr>
+                <w:b w:val="false"/>
+                <w:bCs w:val="false"/>
+              </w:rPr>
+              <w:t xml:space="preserve">Tilvísun sem þarf nánari sögu og skoðun</w:t>
+            </w:r>
+          </w:p>
+        </w:tc>
+      </w:tr>
+      <w:tr>
+        <w:tc>
+          <w:tcPr>
+            <w:tcW w:type="dxa" w:w="2200"/>
+            <w:tcBorders>
+              <w:top w:val="single" w:color="BFBFBF" w:sz="4"/>
+              <w:left w:val="single" w:color="BFBFBF" w:sz="4"/>
+              <w:bottom w:val="single" w:color="BFBFBF" w:sz="4"/>
+              <w:right w:val="single" w:color="BFBFBF" w:sz="4"/>
+            </w:tcBorders>
+            <w:tcMar>
+              <w:top w:type="dxa" w:w="60"/>
+              <w:left w:type="dxa" w:w="120"/>
+              <w:bottom w:type="dxa" w:w="60"/>
+              <w:right w:type="dxa" w:w="120"/>
+            </w:tcMar>
+          </w:tcPr>
+          <w:p>
+            <w:r>
+              <w:rPr>
+                <w:rFonts w:ascii="Consolas" w:cs="Consolas" w:eastAsia="Consolas" w:hAnsi="Consolas"/>
+                <w:b w:val="false"/>
+                <w:bCs w:val="false"/>
+              </w:rPr>
+              <w:t xml:space="preserve">exam</w:t>
+            </w:r>
+          </w:p>
+        </w:tc>
+        <w:tc>
+          <w:tcPr>
+            <w:tcW w:type="dxa" w:w="6826"/>
+            <w:tcBorders>
+              <w:top w:val="single" w:color="BFBFBF" w:sz="4"/>
+              <w:left w:val="single" w:color="BFBFBF" w:sz="4"/>
+              <w:bottom w:val="single" w:color="BFBFBF" w:sz="4"/>
+              <w:right w:val="single" w:color="BFBFBF" w:sz="4"/>
+            </w:tcBorders>
+            <w:tcMar>
+              <w:top w:type="dxa" w:w="60"/>
+              <w:left w:type="dxa" w:w="120"/>
+              <w:bottom w:type="dxa" w:w="60"/>
+              <w:right w:type="dxa" w:w="120"/>
+            </w:tcMar>
+          </w:tcPr>
+          <w:p>
+            <w:r>
+              <w:rPr>
+                <w:b w:val="false"/>
+                <w:bCs w:val="false"/>
+              </w:rPr>
+              <w:t xml:space="preserve">Vandamál sem þarf að skoða</w:t>
+            </w:r>
+          </w:p>
+        </w:tc>
+      </w:tr>
+      <w:tr>
+        <w:tc>
+          <w:tcPr>
+            <w:tcW w:type="dxa" w:w="2200"/>
+            <w:tcBorders>
+              <w:top w:val="single" w:color="BFBFBF" w:sz="4"/>
+              <w:left w:val="single" w:color="BFBFBF" w:sz="4"/>
+              <w:bottom w:val="single" w:color="BFBFBF" w:sz="4"/>
+              <w:right w:val="single" w:color="BFBFBF" w:sz="4"/>
+            </w:tcBorders>
+            <w:tcMar>
+              <w:top w:type="dxa" w:w="60"/>
+              <w:left w:type="dxa" w:w="120"/>
+              <w:bottom w:type="dxa" w:w="60"/>
+              <w:right w:type="dxa" w:w="120"/>
+            </w:tcMar>
+          </w:tcPr>
+          <w:p>
+            <w:r>
+              <w:rPr>
+                <w:rFonts w:ascii="Consolas" w:cs="Consolas" w:eastAsia="Consolas" w:hAnsi="Consolas"/>
+                <w:b w:val="false"/>
+                <w:bCs w:val="false"/>
+              </w:rPr>
               <w:t xml:space="preserve">dose-dispensed</w:t>
             </w:r>
           </w:p>
@@ -4331,7 +4777,7 @@
         <w:keepNext/>
       </w:pPr>
       <w:r>
-        <w:t xml:space="preserve">3.5 · </w:t>
+        <w:t xml:space="preserve">3.7 · </w:t>
       </w:r>
       <w:r>
         <w:rPr>
@@ -4459,7 +4905,7 @@
         <w:keepNext/>
       </w:pPr>
       <w:r>
-        <w:t xml:space="preserve">3.6 · </w:t>
+        <w:t xml:space="preserve">3.8 · </w:t>
       </w:r>
       <w:r>
         <w:rPr>
@@ -4574,7 +5020,7 @@
         <w:keepNext/>
       </w:pPr>
       <w:r>
-        <w:t xml:space="preserve">3.7 · </w:t>
+        <w:t xml:space="preserve">3.9 · </w:t>
       </w:r>
       <w:r>
         <w:rPr>
@@ -4689,7 +5135,7 @@
         <w:keepNext/>
       </w:pPr>
       <w:r>
-        <w:t xml:space="preserve">3.8 · </w:t>
+        <w:t xml:space="preserve">3.10 · </w:t>
       </w:r>
       <w:r>
         <w:rPr>
@@ -4804,7 +5250,7 @@
         <w:keepNext/>
       </w:pPr>
       <w:r>
-        <w:t xml:space="preserve">3.9 · </w:t>
+        <w:t xml:space="preserve">3.11 · </w:t>
       </w:r>
       <w:r>
         <w:rPr>
@@ -4932,7 +5378,7 @@
         <w:keepNext/>
       </w:pPr>
       <w:r>
-        <w:t xml:space="preserve">3.10 · </w:t>
+        <w:t xml:space="preserve">3.12 · </w:t>
       </w:r>
       <w:r>
         <w:rPr>

</xml_diff>

<commit_message>
Medalia: neutral registration wording, matching the website
'Ertu með skráningu á heilsugæslu…', 'Þú sérð skráninguna þína…', '…lyfi sem þú sækir í apótek'. JSON, setup sheets and .docx regenerated.

Co-Authored-By: Claude Opus 5.5 <noreply@anthropic.com>
</commit_message>
<xml_diff>
--- a/docs/medalia/opin-beidni-medalia.docx
+++ b/docs/medalia/opin-beidni-medalia.docx
@@ -3371,7 +3371,7 @@
         <w:spacing w:after="80"/>
       </w:pPr>
       <w:r>
-        <w:t xml:space="preserve">Ertu skráð eða skráður á heilsugæslu þar sem þjónustan er í boði?</w:t>
+        <w:t xml:space="preserve">Ertu með skráningu á heilsugæslu þar sem þjónustan er í boði?</w:t>
       </w:r>
     </w:p>
     <w:p>
@@ -3583,7 +3583,7 @@
           <w:i/>
           <w:iCs/>
         </w:rPr>
-        <w:t xml:space="preserve">Þjónustan er enn sem komið er aðeins í boði fyrir fólk sem er skráð á: Heilsugæslan í Vestmannaeyjum. Ertu ekki viss? Þú sérð á hvaða heilsugæslu þú ert skráð eða skráður á Mínum síðum á island.is.</w:t>
+        <w:t xml:space="preserve">Þjónustan er enn sem komið er aðeins í boði fyrir fólk sem er skráð á: Heilsugæslan í Vestmannaeyjum. Ertu ekki viss? Þú sérð skráninguna þína á Mínum síðum á island.is.</w:t>
       </w:r>
     </w:p>
     <w:p>
@@ -4151,7 +4151,7 @@
           <w:i/>
           <w:iCs/>
         </w:rPr>
-        <w:t xml:space="preserve">Viltu aðeins fá útskýringu á niðurstöðum sem þú hefur þegar fengið, eða endurnýjun á lyfi sem þú sækir sjálf eða sjálfur í apótek? Það getum við gert. Svaraðu þá „Nei“.</w:t>
+        <w:t xml:space="preserve">Viltu aðeins fá útskýringu á niðurstöðum sem þú hefur þegar fengið, eða endurnýjun á lyfi sem þú sækir í apótek? Það getum við gert. Svaraðu þá „Nei“.</w:t>
       </w:r>
     </w:p>
     <w:p>

</xml_diff>

<commit_message>
Medalia screening: softer, explanatory stop messages
Explain what the other service gives the patient (examination, follow-up,
their own doctor) instead of listing what a written service cannot do.

Co-Authored-By: Claude Opus 5.5 <noreply@anthropic.com>
</commit_message>
<xml_diff>
--- a/docs/medalia/opin-beidni-medalia.docx
+++ b/docs/medalia/opin-beidni-medalia.docx
@@ -14,7 +14,7 @@
           <w:sz w:val="40"/>
           <w:szCs w:val="40"/>
         </w:rPr>
-        <w:t xml:space="preserve">Almenn læknisþjónusta — uppsetning í Medalia</w:t>
+        <w:t xml:space="preserve">Opin beiðni — almenn fjarþjónusta</w:t>
       </w:r>
     </w:p>
     <w:p>
@@ -4096,7 +4096,7 @@
         <w:spacing w:after="80"/>
       </w:pPr>
       <w:r>
-        <w:t xml:space="preserve">⛔ Við getum ekki afgreitt þetta erindi í fjarþjónustu.</w:t>
+        <w:t xml:space="preserve">Þetta erindi er betur leyst hjá annarri þjónustu.</w:t>
       </w:r>
     </w:p>
     <w:p>
@@ -4105,7 +4105,7 @@
         <w:spacing w:after="80"/>
       </w:pPr>
       <w:r>
-        <w:t xml:space="preserve">Læknir getur aðeins metið þann sem sendir erindið sjálfur, skráður inn með eigin rafrænum skilríkjum. Við getum ekki metið barn eða annan einstakling út frá lýsingu þinni.</w:t>
+        <w:t xml:space="preserve">Til að læknir geti metið erindi þarf sá sem það snýst um að senda það sjálfur, í eigin nafni og með eigin rafrænum skilríkjum. Þannig er tryggt að upplýsingarnar séu réttar og að svarið berist réttum aðila.</w:t>
       </w:r>
     </w:p>
     <w:p>
@@ -4131,7 +4131,7 @@
         <w:shd w:fill="F2F2F2" w:val="clear"/>
       </w:pPr>
       <w:r>
-        <w:t xml:space="preserve">Vegna barna: hafðu samband við heilsugæslu barnsins, eða hringdu í 1700 til að fá ráðgjöf.</w:t>
+        <w:t xml:space="preserve">Heilsugæsla barnsins getur aðstoðað vegna barna, og í síma 1700 færðu ráðgjöf allan sólarhringinn.</w:t>
       </w:r>
     </w:p>
     <w:p>
@@ -4144,7 +4144,7 @@
         <w:shd w:fill="F2F2F2" w:val="clear"/>
       </w:pPr>
       <w:r>
-        <w:t xml:space="preserve">Veikist barn skyndilega eða alvarlega: farðu á næstu bráðamóttöku eða hringdu í 112.</w:t>
+        <w:t xml:space="preserve">Ef barn veikist skyndilega eða alvarlega skaltu fara á næstu bráðamóttöku eða hringja í 112.</w:t>
       </w:r>
     </w:p>
     <w:p>
@@ -4153,7 +4153,7 @@
         <w:spacing w:after="80"/>
       </w:pPr>
       <w:r>
-        <w:t xml:space="preserve">Þú þarft ekki að senda erindið. Ef þú svaraðir þessu fyrir mistök, breyttu svarinu í „Nei“ til að halda áfram.</w:t>
+        <w:t xml:space="preserve">Þú þarft því ekki að senda erindið hingað. Ef þú svaraðir þessu fyrir mistök getur þú breytt svarinu í „Nei“ og haldið áfram.</w:t>
       </w:r>
     </w:p>
     <w:p>
@@ -4545,7 +4545,7 @@
         <w:spacing w:after="80"/>
       </w:pPr>
       <w:r>
-        <w:t xml:space="preserve">⛔ Við getum ekki afgreitt þetta erindi í fjarþjónustu.</w:t>
+        <w:t xml:space="preserve">Þetta erindi er betur leyst hjá annarri þjónustu.</w:t>
       </w:r>
     </w:p>
     <w:p>
@@ -4554,7 +4554,7 @@
         <w:spacing w:after="80"/>
       </w:pPr>
       <w:r>
-        <w:t xml:space="preserve">Við biðjum ekki um rannsóknir í fjarþjónustu. Læknirinn sem biður um rannsókn ber ábyrgð á að fylgja niðurstöðunum eftir og það er best gert þar sem þú ert í reglulegri eftirfylgd.</w:t>
+        <w:t xml:space="preserve">Læknirinn sem biður um rannsókn fylgir líka niðurstöðunum eftir, og það fer best á því að sá læknir þekki þig og sjái um eftirfylgdina.</w:t>
       </w:r>
     </w:p>
     <w:p>
@@ -4567,7 +4567,7 @@
         <w:shd w:fill="F2F2F2" w:val="clear"/>
       </w:pPr>
       <w:r>
-        <w:t xml:space="preserve">Hafðu samband við heilsugæsluna þína eða heimilislækni.</w:t>
+        <w:t xml:space="preserve">Heilsugæslan þín eða heimilislæknirinn getur metið hvort rannsókn á við og fylgt niðurstöðunum eftir.</w:t>
       </w:r>
     </w:p>
     <w:p>
@@ -4576,7 +4576,7 @@
         <w:spacing w:after="80"/>
       </w:pPr>
       <w:r>
-        <w:t xml:space="preserve">Þú þarft ekki að senda erindið. Ef þú svaraðir þessu fyrir mistök, breyttu svarinu í „Nei“ til að halda áfram.</w:t>
+        <w:t xml:space="preserve">Þú þarft því ekki að senda erindið hingað. Ef þú svaraðir þessu fyrir mistök getur þú breytt svarinu í „Nei“ og haldið áfram.</w:t>
       </w:r>
     </w:p>
     <w:p>
@@ -4947,7 +4947,7 @@
         <w:spacing w:after="80"/>
       </w:pPr>
       <w:r>
-        <w:t xml:space="preserve">⛔ Við getum ekki afgreitt þetta erindi í fjarþjónustu.</w:t>
+        <w:t xml:space="preserve">Þetta erindi er betur leyst hjá annarri þjónustu.</w:t>
       </w:r>
     </w:p>
     <w:p>
@@ -4956,7 +4956,7 @@
         <w:spacing w:after="80"/>
       </w:pPr>
       <w:r>
-        <w:t xml:space="preserve">Beiðni um myndgreiningu eða speglun þarf að byggja á viðtali og skoðun, og niðurstöðunum þarf að fylgja eftir. Það er ekki hægt í skriflegri fjarþjónustu.</w:t>
+        <w:t xml:space="preserve">Myndgreining og speglanir eru pantaðar í framhaldi af viðtali og skoðun, og niðurstöðunum þarf svo að fylgja eftir. Það er best gert þar sem læknir getur hitt þig.</w:t>
       </w:r>
     </w:p>
     <w:p>
@@ -4969,7 +4969,7 @@
         <w:shd w:fill="F2F2F2" w:val="clear"/>
       </w:pPr>
       <w:r>
-        <w:t xml:space="preserve">Hafðu samband við heilsugæsluna þína eða heimilislækni.</w:t>
+        <w:t xml:space="preserve">Heilsugæslan þín eða heimilislæknirinn getur metið hvort rannsóknin á við.</w:t>
       </w:r>
     </w:p>
     <w:p>
@@ -4982,7 +4982,7 @@
         <w:shd w:fill="F2F2F2" w:val="clear"/>
       </w:pPr>
       <w:r>
-        <w:t xml:space="preserve">Eftir slys eða áverka: farðu á slysa- og bráðamóttöku.</w:t>
+        <w:t xml:space="preserve">Eftir slys eða áverka er best að leita á slysa- og bráðamóttöku.</w:t>
       </w:r>
     </w:p>
     <w:p>
@@ -4991,7 +4991,7 @@
         <w:spacing w:after="80"/>
       </w:pPr>
       <w:r>
-        <w:t xml:space="preserve">Þú þarft ekki að senda erindið. Ef þú svaraðir þessu fyrir mistök, breyttu svarinu í „Nei“ til að halda áfram.</w:t>
+        <w:t xml:space="preserve">Þú þarft því ekki að senda erindið hingað. Ef þú svaraðir þessu fyrir mistök getur þú breytt svarinu í „Nei“ og haldið áfram.</w:t>
       </w:r>
     </w:p>
     <w:p>
@@ -5362,7 +5362,7 @@
         <w:spacing w:after="80"/>
       </w:pPr>
       <w:r>
-        <w:t xml:space="preserve">⛔ Við getum ekki afgreitt þetta erindi í fjarþjónustu.</w:t>
+        <w:t xml:space="preserve">Þetta erindi er betur leyst hjá annarri þjónustu.</w:t>
       </w:r>
     </w:p>
     <w:p>
@@ -5371,7 +5371,7 @@
         <w:spacing w:after="80"/>
       </w:pPr>
       <w:r>
-        <w:t xml:space="preserve">Góð tilvísun byggir á ítarlegri sögu og skoðun svo sérfræðingurinn fái þær upplýsingar sem hann þarf. Það getum við ekki veitt skriflega.</w:t>
+        <w:t xml:space="preserve">Tilvísun nýtist sérfræðingnum best þegar henni fylgja góð saga og niðurstöður skoðunar. Þess vegna er best að hún komi frá lækni sem hefur hitt þig.</w:t>
       </w:r>
     </w:p>
     <w:p>
@@ -5384,7 +5384,7 @@
         <w:shd w:fill="F2F2F2" w:val="clear"/>
       </w:pPr>
       <w:r>
-        <w:t xml:space="preserve">Hafðu samband við heilsugæsluna þína eða heimilislækni.</w:t>
+        <w:t xml:space="preserve">Heilsugæslan þín eða heimilislæknirinn getur skrifað tilvísunina.</w:t>
       </w:r>
     </w:p>
     <w:p>
@@ -5397,7 +5397,7 @@
         <w:shd w:fill="F2F2F2" w:val="clear"/>
       </w:pPr>
       <w:r>
-        <w:t xml:space="preserve">Fullorðnir geta oft bókað tíma beint hjá sérfræðilækni án tilvísunar.</w:t>
+        <w:t xml:space="preserve">Hjá mörgum sérfræðilæknum geta fullorðnir líka bókað tíma beint, án tilvísunar.</w:t>
       </w:r>
     </w:p>
     <w:p>
@@ -5406,7 +5406,7 @@
         <w:spacing w:after="80"/>
       </w:pPr>
       <w:r>
-        <w:t xml:space="preserve">Þú þarft ekki að senda erindið. Ef þú svaraðir þessu fyrir mistök, breyttu svarinu í „Nei“ til að halda áfram.</w:t>
+        <w:t xml:space="preserve">Þú þarft því ekki að senda erindið hingað. Ef þú svaraðir þessu fyrir mistök getur þú breytt svarinu í „Nei“ og haldið áfram.</w:t>
       </w:r>
     </w:p>
     <w:p>
@@ -5777,7 +5777,7 @@
         <w:spacing w:after="80"/>
       </w:pPr>
       <w:r>
-        <w:t xml:space="preserve">⛔ Við getum ekki afgreitt þetta erindi í fjarþjónustu.</w:t>
+        <w:t xml:space="preserve">Þetta erindi er betur leyst hjá annarri þjónustu.</w:t>
       </w:r>
     </w:p>
     <w:p>
@@ -5786,7 +5786,7 @@
         <w:spacing w:after="80"/>
       </w:pPr>
       <w:r>
-        <w:t xml:space="preserve">Læknirinn getur ekki hlustað, þreifað eða horft í eyru og háls í gegnum skriflegt erindi. Þegar skoðun ræður greiningunni er ekki öruggt að meta vandamálið hér.</w:t>
+        <w:t xml:space="preserve">Sum einkenni þarf að skoða til að hægt sé að meta þau örugglega. Þá er best að hitta lækni, svo þú fáir rétta greiningu og meðferð.</w:t>
       </w:r>
     </w:p>
     <w:p>
@@ -5799,7 +5799,7 @@
         <w:shd w:fill="F2F2F2" w:val="clear"/>
       </w:pPr>
       <w:r>
-        <w:t xml:space="preserve">Hafðu samband við heilsugæsluna þína.</w:t>
+        <w:t xml:space="preserve">Heilsugæslan þín tekur á móti þér á dagtíma.</w:t>
       </w:r>
     </w:p>
     <w:p>
@@ -5812,7 +5812,7 @@
         <w:shd w:fill="F2F2F2" w:val="clear"/>
       </w:pPr>
       <w:r>
-        <w:t xml:space="preserve">Utan opnunartíma heilsugæslunnar: Læknavaktin, sími 1700.</w:t>
+        <w:t xml:space="preserve">Utan opnunartíma heilsugæslunnar færðu ráð og leiðbeiningar í síma 1700.</w:t>
       </w:r>
     </w:p>
     <w:p>
@@ -5825,7 +5825,7 @@
         <w:shd w:fill="F2F2F2" w:val="clear"/>
       </w:pPr>
       <w:r>
-        <w:t xml:space="preserve">Eftir slys eða áverka: farðu á slysa- og bráðamóttöku.</w:t>
+        <w:t xml:space="preserve">Eftir slys eða áverka er best að leita á slysa- og bráðamóttöku.</w:t>
       </w:r>
     </w:p>
     <w:p>
@@ -5834,7 +5834,7 @@
         <w:spacing w:after="80"/>
       </w:pPr>
       <w:r>
-        <w:t xml:space="preserve">Þú þarft ekki að senda erindið. Ef þú svaraðir þessu fyrir mistök, breyttu svarinu í „Nei“ til að halda áfram.</w:t>
+        <w:t xml:space="preserve">Þú þarft því ekki að senda erindið hingað. Ef þú svaraðir þessu fyrir mistök getur þú breytt svarinu í „Nei“ og haldið áfram.</w:t>
       </w:r>
     </w:p>
     <w:p>
@@ -6226,7 +6226,7 @@
         <w:spacing w:after="80"/>
       </w:pPr>
       <w:r>
-        <w:t xml:space="preserve">⛔ Við getum ekki afgreitt þetta erindi í fjarþjónustu.</w:t>
+        <w:t xml:space="preserve">Þetta erindi er betur leyst hjá annarri þjónustu.</w:t>
       </w:r>
     </w:p>
     <w:p>
@@ -6235,7 +6235,7 @@
         <w:spacing w:after="80"/>
       </w:pPr>
       <w:r>
-        <w:t xml:space="preserve">Skömmtuð lyf eru afgreidd eftir skömmtunarkorti sem læknirinn þinn heldur utan um. Til að öll lyfin skili sér rétt í rúlluna þarf sá læknir að gera breytingarnar.</w:t>
+        <w:t xml:space="preserve">Lyfjarúllan er sett saman eftir skömmtunarkorti sem læknirinn þinn heldur utan um. Til að öll lyfin skili sér rétt í rúlluna er öruggast að sá læknir geri breytingarnar.</w:t>
       </w:r>
     </w:p>
     <w:p>
@@ -6248,7 +6248,7 @@
         <w:shd w:fill="F2F2F2" w:val="clear"/>
       </w:pPr>
       <w:r>
-        <w:t xml:space="preserve">Hafðu samband við heilsugæsluna þína eða heimilislækni.</w:t>
+        <w:t xml:space="preserve">Heilsugæslan þín eða heimilislæknirinn sér um breytingar á skömmtuninni.</w:t>
       </w:r>
     </w:p>
     <w:p>
@@ -6261,7 +6261,7 @@
         <w:shd w:fill="F2F2F2" w:val="clear"/>
       </w:pPr>
       <w:r>
-        <w:t xml:space="preserve">Apótekið sem skammtar lyfin getur leiðbeint þér um næstu skref.</w:t>
+        <w:t xml:space="preserve">Apótekið sem skammtar lyfin getur líka leiðbeint þér um næstu skref.</w:t>
       </w:r>
     </w:p>
     <w:p>
@@ -6270,7 +6270,7 @@
         <w:spacing w:after="80"/>
       </w:pPr>
       <w:r>
-        <w:t xml:space="preserve">Þú þarft ekki að senda erindið. Ef þú svaraðir þessu fyrir mistök, breyttu svarinu í „Nei“ til að halda áfram.</w:t>
+        <w:t xml:space="preserve">Þú þarft því ekki að senda erindið hingað. Ef þú svaraðir þessu fyrir mistök getur þú breytt svarinu í „Nei“ og haldið áfram.</w:t>
       </w:r>
     </w:p>
     <w:p>

</xml_diff>

<commit_message>
Medalia screening: gentler 'someone else' stop message
Co-Authored-By: Claude Opus 5.5 <noreply@anthropic.com>
</commit_message>
<xml_diff>
--- a/docs/medalia/opin-beidni-medalia.docx
+++ b/docs/medalia/opin-beidni-medalia.docx
@@ -4105,7 +4105,7 @@
         <w:spacing w:after="80"/>
       </w:pPr>
       <w:r>
-        <w:t xml:space="preserve">Til að læknir geti metið erindi þarf sá sem það snýst um að senda það sjálfur, í eigin nafni og með eigin rafrænum skilríkjum. Þannig er tryggt að upplýsingarnar séu réttar og að svarið berist réttum aðila.</w:t>
+        <w:t xml:space="preserve">Þessi þjónusta er ætluð fyrir erindi sem fólk sendir vegna sjálfs sín. Læknirinn þarf að geta spurt þann sem erindið snýst um nánar, og svar, lyfseðill eða vottorð þarf að skrást á réttan einstakling.</w:t>
       </w:r>
     </w:p>
     <w:p>
@@ -4118,7 +4118,7 @@
         <w:shd w:fill="F2F2F2" w:val="clear"/>
       </w:pPr>
       <w:r>
-        <w:t xml:space="preserve">Fullorðnir geta sent eigið erindi hingað.</w:t>
+        <w:t xml:space="preserve">Fullorðnir geta sent eigið erindi hér, með eigin rafrænum skilríkjum.</w:t>
       </w:r>
     </w:p>
     <w:p>
@@ -4131,7 +4131,7 @@
         <w:shd w:fill="F2F2F2" w:val="clear"/>
       </w:pPr>
       <w:r>
-        <w:t xml:space="preserve">Heilsugæsla barnsins getur aðstoðað vegna barna, og í síma 1700 færðu ráðgjöf allan sólarhringinn.</w:t>
+        <w:t xml:space="preserve">Vegna barna er best að hafa samband við heilsugæslu barnsins. Í síma 1700 færðu líka ráðgjöf allan sólarhringinn.</w:t>
       </w:r>
     </w:p>
     <w:p>

</xml_diff>